<commit_message>
Refactor code to adhere to SOLID principles
</commit_message>
<xml_diff>
--- a/src/main/resources/sql/Документ Microsoft Word.docx
+++ b/src/main/resources/sql/Документ Microsoft Word.docx
@@ -531,6 +531,28 @@
         </w:tc>
       </w:tr>
     </w:tbl>
+    <w:p>
+      <w:pPr>
+        <w:rPr>
+          <w:rFonts w:ascii="Times New Roman" w:hAnsi="Times New Roman" w:cs="Times New Roman"/>
+          <w:b/>
+          <w:bCs/>
+          <w:sz w:val="28"/>
+          <w:szCs w:val="28"/>
+        </w:rPr>
+      </w:pPr>
+    </w:p>
+    <w:p>
+      <w:pPr>
+        <w:rPr>
+          <w:rFonts w:ascii="Times New Roman" w:hAnsi="Times New Roman" w:cs="Times New Roman"/>
+          <w:b/>
+          <w:bCs/>
+          <w:sz w:val="28"/>
+          <w:szCs w:val="28"/>
+        </w:rPr>
+      </w:pPr>
+    </w:p>
     <w:p>
       <w:pPr>
         <w:rPr>
@@ -1267,6 +1289,17 @@
     </w:p>
     <w:p>
       <w:pPr>
+        <w:rPr>
+          <w:rFonts w:ascii="Times New Roman" w:hAnsi="Times New Roman" w:cs="Times New Roman"/>
+          <w:b/>
+          <w:bCs/>
+          <w:sz w:val="28"/>
+          <w:szCs w:val="28"/>
+        </w:rPr>
+      </w:pPr>
+    </w:p>
+    <w:p>
+      <w:pPr>
         <w:ind w:firstLine="708"/>
         <w:rPr>
           <w:rFonts w:ascii="Times New Roman" w:hAnsi="Times New Roman" w:cs="Times New Roman"/>
@@ -1392,7 +1425,6 @@
                 <w:sz w:val="28"/>
                 <w:szCs w:val="28"/>
               </w:rPr>
-              <w:lastRenderedPageBreak/>
               <w:t>Поле</w:t>
             </w:r>
           </w:p>
@@ -1799,6 +1831,17 @@
         </w:tc>
       </w:tr>
     </w:tbl>
+    <w:p>
+      <w:pPr>
+        <w:rPr>
+          <w:rFonts w:ascii="Times New Roman" w:hAnsi="Times New Roman" w:cs="Times New Roman"/>
+          <w:b/>
+          <w:bCs/>
+          <w:sz w:val="28"/>
+          <w:szCs w:val="28"/>
+        </w:rPr>
+      </w:pPr>
+    </w:p>
     <w:p>
       <w:pPr>
         <w:rPr>
@@ -2180,6 +2223,17 @@
     </w:p>
     <w:p>
       <w:pPr>
+        <w:rPr>
+          <w:rFonts w:ascii="Times New Roman" w:hAnsi="Times New Roman" w:cs="Times New Roman"/>
+          <w:b/>
+          <w:bCs/>
+          <w:sz w:val="28"/>
+          <w:szCs w:val="28"/>
+        </w:rPr>
+      </w:pPr>
+    </w:p>
+    <w:p>
+      <w:pPr>
         <w:ind w:firstLine="708"/>
         <w:rPr>
           <w:rFonts w:ascii="Times New Roman" w:hAnsi="Times New Roman" w:cs="Times New Roman"/>
@@ -2778,6 +2832,7 @@
                 <w:sz w:val="28"/>
                 <w:szCs w:val="28"/>
               </w:rPr>
+              <w:lastRenderedPageBreak/>
               <w:t>Поле</w:t>
             </w:r>
           </w:p>
@@ -3110,7 +3165,6 @@
     </w:p>
     <w:p>
       <w:pPr>
-        <w:ind w:firstLine="708"/>
         <w:rPr>
           <w:rFonts w:ascii="Times New Roman" w:hAnsi="Times New Roman" w:cs="Times New Roman"/>
           <w:b/>
@@ -3119,7 +3173,10 @@
           <w:szCs w:val="28"/>
         </w:rPr>
       </w:pPr>
-      <w:r>
+    </w:p>
+    <w:p>
+      <w:pPr>
+        <w:ind w:firstLine="708"/>
         <w:rPr>
           <w:rFonts w:ascii="Times New Roman" w:hAnsi="Times New Roman" w:cs="Times New Roman"/>
           <w:b/>
@@ -3127,7 +3184,15 @@
           <w:sz w:val="28"/>
           <w:szCs w:val="28"/>
         </w:rPr>
-        <w:lastRenderedPageBreak/>
+      </w:pPr>
+      <w:r>
+        <w:rPr>
+          <w:rFonts w:ascii="Times New Roman" w:hAnsi="Times New Roman" w:cs="Times New Roman"/>
+          <w:b/>
+          <w:bCs/>
+          <w:sz w:val="28"/>
+          <w:szCs w:val="28"/>
+        </w:rPr>
         <w:t xml:space="preserve">7. Таблица </w:t>
       </w:r>
       <w:proofErr w:type="spellStart"/>
@@ -4025,6 +4090,7 @@
           <w:sz w:val="28"/>
           <w:szCs w:val="28"/>
         </w:rPr>
+        <w:lastRenderedPageBreak/>
         <w:t>Удаление пользователей.</w:t>
       </w:r>
     </w:p>
@@ -4204,7 +4270,6 @@
           <w:sz w:val="28"/>
           <w:szCs w:val="28"/>
         </w:rPr>
-        <w:lastRenderedPageBreak/>
         <w:t>Генерация кодов для верификации электронной почты.</w:t>
       </w:r>
     </w:p>

</xml_diff>